<commit_message>
Remove CNIL signature item from SSIAP labels
Remove the CNIL row from the SSIAP checklist and its Word template. Preserve the remaining document statuses and exam dossier row.

Validation: 7 label tests pass; Word label rendered and reviewed on one A4 page.
</commit_message>
<xml_diff>
--- a/templates_word/etiquette_ssiap.docx
+++ b/templates_word/etiquette_ssiap.docx
@@ -353,23 +353,6 @@
                 <w:sz w:val="24"/>
               </w:rPr>
               <w:t>{{SSIAP_ITEM_6}}</w:t>
-            </w:r>
-          </w:p>
-          <w:p>
-            <w:pPr>
-              <w:pStyle w:val="AveryStyle1"/>
-              <w:ind w:left="0" w:firstLine="0"/>
-              <w:rPr>
-                <w:sz w:val="24"/>
-                <w:szCs w:val="14"/>
-              </w:rPr>
-            </w:pPr>
-            <w:r>
-              <w:rPr>
-                <w:rFonts w:ascii="Arial" w:hAnsi="Arial"/>
-                <w:sz w:val="24"/>
-              </w:rPr>
-              <w:t>{{SSIAP_ITEM_7}}</w:t>
             </w:r>
           </w:p>
         </w:tc>

</xml_diff>